<commit_message>
made a little progress
</commit_message>
<xml_diff>
--- a/tex/LMCS2025/reviews.docx
+++ b/tex/LMCS2025/reviews.docx
@@ -1350,7 +1350,26 @@
           <w:sz w:val="16"/>
           <w:szCs w:val="16"/>
         </w:rPr>
-        <w:t>- Example 3: The modules in this example share variables (y and x). I wonder whether there is a choreography that describes their behavior, since my understanding is that variables are local to modules in choreographies.</w:t>
+        <w:t xml:space="preserve">- </w:t>
+      </w:r>
+      <w:r>
+        <w:rPr>
+          <w:rFonts w:ascii="Courier New" w:hAnsi="Courier New" w:cs="Courier New"/>
+          <w:color w:val="000000"/>
+          <w:sz w:val="16"/>
+          <w:szCs w:val="16"/>
+          <w:highlight w:val="green"/>
+        </w:rPr>
+        <w:t>Example 3: The modules in this example share variables (y and x). I wonder whether there is a choreography that describes their behavior, since my understanding is that variables are local to modules in choreographies</w:t>
+      </w:r>
+      <w:r>
+        <w:rPr>
+          <w:rFonts w:ascii="Courier New" w:hAnsi="Courier New" w:cs="Courier New"/>
+          <w:color w:val="000000"/>
+          <w:sz w:val="16"/>
+          <w:szCs w:val="16"/>
+        </w:rPr>
+        <w:t>.</w:t>
       </w:r>
     </w:p>
     <w:p>
@@ -1480,7 +1499,17 @@
           <w:sz w:val="16"/>
           <w:szCs w:val="16"/>
         </w:rPr>
-        <w:t>- The choice of annotating choreographies with labels seems somewhat ad hoc. Why are they not introduced as a syntactic element of choreographies (as is often done with communication channels in standard choreographies), given that they are necessary and play a role in the implementation?</w:t>
+        <w:t xml:space="preserve">- </w:t>
+      </w:r>
+      <w:r>
+        <w:rPr>
+          <w:rFonts w:ascii="Courier New" w:hAnsi="Courier New" w:cs="Courier New"/>
+          <w:color w:val="000000"/>
+          <w:sz w:val="16"/>
+          <w:szCs w:val="16"/>
+          <w:highlight w:val="green"/>
+        </w:rPr>
+        <w:t>The choice of annotating choreographies with labels seems somewhat ad hoc. Why are they not introduced as a syntactic element of choreographies (as is often done with communication channels in standard choreographies), given that they are necessary and play a role in the implementation?</w:t>
       </w:r>
     </w:p>
     <w:p>

</xml_diff>

<commit_message>
done with reviewer 1, except from comment about allsync...now moving to Reviewer 2
</commit_message>
<xml_diff>
--- a/tex/LMCS2025/reviews.docx
+++ b/tex/LMCS2025/reviews.docx
@@ -1565,14 +1565,16 @@
           <w:color w:val="000000"/>
           <w:sz w:val="16"/>
           <w:szCs w:val="16"/>
-        </w:rPr>
-      </w:pPr>
-      <w:r>
-        <w:rPr>
-          <w:rFonts w:ascii="Courier New" w:hAnsi="Courier New" w:cs="Courier New"/>
-          <w:color w:val="000000"/>
-          <w:sz w:val="16"/>
-          <w:szCs w:val="16"/>
+          <w:highlight w:val="green"/>
+        </w:rPr>
+      </w:pPr>
+      <w:r>
+        <w:rPr>
+          <w:rFonts w:ascii="Courier New" w:hAnsi="Courier New" w:cs="Courier New"/>
+          <w:color w:val="000000"/>
+          <w:sz w:val="16"/>
+          <w:szCs w:val="16"/>
+          <w:highlight w:val="green"/>
         </w:rPr>
         <w:t>Page 12</w:t>
       </w:r>
@@ -1602,6 +1604,7 @@
           <w:color w:val="000000"/>
           <w:sz w:val="16"/>
           <w:szCs w:val="16"/>
+          <w:highlight w:val="green"/>
         </w:rPr>
       </w:pPr>
     </w:p>
@@ -1638,6 +1641,7 @@
           <w:color w:val="000000"/>
           <w:sz w:val="16"/>
           <w:szCs w:val="16"/>
+          <w:highlight w:val="green"/>
         </w:rPr>
         <w:t xml:space="preserve">- Projection of conditionals: I do not understand why the conditional is not projected. I would expect that </w:t>
       </w:r>
@@ -1648,6 +1652,7 @@
           <w:color w:val="000000"/>
           <w:sz w:val="16"/>
           <w:szCs w:val="16"/>
+          <w:highlight w:val="green"/>
         </w:rPr>
         <w:t>E</w:t>
       </w:r>
@@ -1658,6 +1663,7 @@
           <w:color w:val="000000"/>
           <w:sz w:val="16"/>
           <w:szCs w:val="16"/>
+          <w:highlight w:val="green"/>
         </w:rPr>
         <w:t xml:space="preserve"> should be evaluated locally by p (hence all relevant information must be local </w:t>
       </w:r>
@@ -1668,6 +1674,7 @@
           <w:color w:val="000000"/>
           <w:sz w:val="16"/>
           <w:szCs w:val="16"/>
+          <w:highlight w:val="green"/>
         </w:rPr>
         <w:t>to p</w:t>
       </w:r>
@@ -1678,6 +1685,7 @@
           <w:color w:val="000000"/>
           <w:sz w:val="16"/>
           <w:szCs w:val="16"/>
+          <w:highlight w:val="green"/>
         </w:rPr>
         <w:t>). This contrasts with the statement on page 5: “The term if E\@p then C1 else C2 denotes a system where module p evaluates the guard E (which can contain variables located at other modules) and then (deterministically) branches accordingly.” I presume that there is some underlying assumption on the projection, but I could not find its definition.</w:t>
       </w:r>
@@ -1743,6 +1751,7 @@
           <w:color w:val="000000"/>
           <w:sz w:val="16"/>
           <w:szCs w:val="16"/>
+          <w:highlight w:val="green"/>
         </w:rPr>
         <w:t xml:space="preserve">- Projection of choreography variable X: This relies on </w:t>
       </w:r>
@@ -1753,6 +1762,7 @@
           <w:color w:val="000000"/>
           <w:sz w:val="16"/>
           <w:szCs w:val="16"/>
+          <w:highlight w:val="green"/>
         </w:rPr>
         <w:t>defs</w:t>
       </w:r>
@@ -1763,6 +1773,7 @@
           <w:color w:val="000000"/>
           <w:sz w:val="16"/>
           <w:szCs w:val="16"/>
+          <w:highlight w:val="green"/>
         </w:rPr>
         <w:t xml:space="preserve">(X). I presume that this function should be explicitly included in the definition. Moreover, I assume that you need to impose some conditions, such as requiring that the image of any </w:t>
       </w:r>
@@ -1773,6 +1784,7 @@
           <w:color w:val="000000"/>
           <w:sz w:val="16"/>
           <w:szCs w:val="16"/>
+          <w:highlight w:val="green"/>
         </w:rPr>
         <w:t>X_i</w:t>
       </w:r>
@@ -1783,6 +1795,7 @@
           <w:color w:val="000000"/>
           <w:sz w:val="16"/>
           <w:szCs w:val="16"/>
+          <w:highlight w:val="green"/>
         </w:rPr>
         <w:t xml:space="preserve"> is distinct from nodes(C) </w:t>
       </w:r>
@@ -1793,6 +1806,7 @@
           <w:color w:val="000000"/>
           <w:sz w:val="16"/>
           <w:szCs w:val="16"/>
+          <w:highlight w:val="green"/>
         </w:rPr>
         <w:t>and also</w:t>
       </w:r>
@@ -1803,6 +1817,7 @@
           <w:color w:val="000000"/>
           <w:sz w:val="16"/>
           <w:szCs w:val="16"/>
+          <w:highlight w:val="green"/>
         </w:rPr>
         <w:t xml:space="preserve"> distinct from the nodes in all definitions. The passage on page 13 (“For recursive calls... </w:t>
       </w:r>
@@ -1813,6 +1828,7 @@
           <w:color w:val="000000"/>
           <w:sz w:val="16"/>
           <w:szCs w:val="16"/>
+          <w:highlight w:val="green"/>
         </w:rPr>
         <w:t>defs</w:t>
       </w:r>
@@ -1823,6 +1839,7 @@
           <w:color w:val="000000"/>
           <w:sz w:val="16"/>
           <w:szCs w:val="16"/>
+          <w:highlight w:val="green"/>
         </w:rPr>
         <w:t xml:space="preserve">”) appears somewhat rushed, and I believe </w:t>
       </w:r>
@@ -1833,6 +1850,7 @@
           <w:color w:val="000000"/>
           <w:sz w:val="16"/>
           <w:szCs w:val="16"/>
+          <w:highlight w:val="green"/>
         </w:rPr>
         <w:t>defs</w:t>
       </w:r>
@@ -1843,6 +1861,7 @@
           <w:color w:val="000000"/>
           <w:sz w:val="16"/>
           <w:szCs w:val="16"/>
+          <w:highlight w:val="green"/>
         </w:rPr>
         <w:t xml:space="preserve"> deserves a formal definition.</w:t>
       </w:r>
@@ -1974,7 +1993,17 @@
           <w:sz w:val="16"/>
           <w:szCs w:val="16"/>
         </w:rPr>
-        <w:t xml:space="preserve">- Projection of updates: Are you assuming that updates at the choreography level are well-formed in some way? For instance, could an assignment y' = x </w:t>
+        <w:t xml:space="preserve">- </w:t>
+      </w:r>
+      <w:r>
+        <w:rPr>
+          <w:rFonts w:ascii="Courier New" w:hAnsi="Courier New" w:cs="Courier New"/>
+          <w:color w:val="000000"/>
+          <w:sz w:val="16"/>
+          <w:szCs w:val="16"/>
+          <w:highlight w:val="green"/>
+        </w:rPr>
+        <w:t xml:space="preserve">Projection of updates: Are you assuming that updates at the choreography level are well-formed in some way? For instance, could an assignment y' = x </w:t>
       </w:r>
       <w:proofErr w:type="gramStart"/>
       <w:r>
@@ -1983,6 +2012,7 @@
           <w:color w:val="000000"/>
           <w:sz w:val="16"/>
           <w:szCs w:val="16"/>
+          <w:highlight w:val="green"/>
         </w:rPr>
         <w:t>occur</w:t>
       </w:r>
@@ -1993,6 +2023,7 @@
           <w:color w:val="000000"/>
           <w:sz w:val="16"/>
           <w:szCs w:val="16"/>
+          <w:highlight w:val="green"/>
         </w:rPr>
         <w:t xml:space="preserve"> where y belongs to p and x to q? If not, this restriction should be stated clearly. Moreover, from which element of the choreography is the assignment derived? If I have missed this, it should nonetheless be clarified explicitly in the paper.</w:t>
       </w:r>
@@ -2123,6 +2154,7 @@
           <w:color w:val="000000"/>
           <w:sz w:val="16"/>
           <w:szCs w:val="16"/>
+          <w:highlight w:val="green"/>
         </w:rPr>
         <w:t>- Definition 4: Is it not the case that the choreography is annotated? Hence, the interaction p -&gt; {p</w:t>
       </w:r>
@@ -2133,6 +2165,7 @@
           <w:color w:val="000000"/>
           <w:sz w:val="16"/>
           <w:szCs w:val="16"/>
+          <w:highlight w:val="green"/>
         </w:rPr>
         <w:t>1,…</w:t>
       </w:r>
@@ -2143,6 +2176,7 @@
           <w:color w:val="000000"/>
           <w:sz w:val="16"/>
           <w:szCs w:val="16"/>
+          <w:highlight w:val="green"/>
         </w:rPr>
         <w:t>,</w:t>
       </w:r>
@@ -2153,6 +2187,7 @@
           <w:color w:val="000000"/>
           <w:sz w:val="16"/>
           <w:szCs w:val="16"/>
+          <w:highlight w:val="green"/>
         </w:rPr>
         <w:t>pn</w:t>
       </w:r>
@@ -2163,6 +2198,7 @@
           <w:color w:val="000000"/>
           <w:sz w:val="16"/>
           <w:szCs w:val="16"/>
+          <w:highlight w:val="green"/>
         </w:rPr>
         <w:t xml:space="preserve">} should also be labeled. Furthermore, from where are the labels </w:t>
       </w:r>
@@ -2173,6 +2209,7 @@
           <w:color w:val="000000"/>
           <w:sz w:val="16"/>
           <w:szCs w:val="16"/>
+          <w:highlight w:val="green"/>
         </w:rPr>
         <w:t>l_j</w:t>
       </w:r>
@@ -2183,6 +2220,7 @@
           <w:color w:val="000000"/>
           <w:sz w:val="16"/>
           <w:szCs w:val="16"/>
+          <w:highlight w:val="green"/>
         </w:rPr>
         <w:t xml:space="preserve"> drawn? Does this mean that every interaction uses the same set of labels l_1, ...?</w:t>
       </w:r>
@@ -2313,6 +2351,7 @@
           <w:color w:val="000000"/>
           <w:sz w:val="16"/>
           <w:szCs w:val="16"/>
+          <w:highlight w:val="green"/>
         </w:rPr>
         <w:t>- How are variables quantified? Are S, S', and \iota universally quantified?</w:t>
       </w:r>
@@ -2350,6 +2389,7 @@
           <w:color w:val="000000"/>
           <w:sz w:val="16"/>
           <w:szCs w:val="16"/>
+          <w:highlight w:val="green"/>
         </w:rPr>
         <w:t>- The correspondence theorem (Th. 1) appears somewhat weak, since it merely shows that projections can mimic the first computational step, as far as the state is concerned. It does not provide evidence that subsequent steps preserve equivalence. I am particularly concerned that the projections may become misaligned with respect to \iota. Thus, it is not the case that the second step necessarily advances all projections corresponding to a given \iota. This issue is clear in the case of conditionals, and I also wonder about process variables.</w:t>
       </w:r>

</xml_diff>